<commit_message>
docs: update GitHub repository URL in README, setup guide and report
</commit_message>
<xml_diff>
--- a/MLOps_Assignment1_Report_2025CS05041.docx
+++ b/MLOps_Assignment1_Report_2025CS05041.docx
@@ -1751,7 +1751,7 @@
         <w:rPr>
           <w:rFonts w:ascii="Courier New" w:hAnsi="Courier New"/>
         </w:rPr>
-        <w:t>git clone &lt;repo-url&gt; &amp;&amp; cd heart-disease-mlops</w:t>
+        <w:t>git clone https://github.com/dharmendra-2025cs05041/heart-disease-mlops &amp;&amp; cd heart-disease-mlops</w:t>
         <w:br/>
         <w:t>python3 -m venv venv &amp;&amp; source venv/bin/activate</w:t>
         <w:br/>
@@ -1846,7 +1846,7 @@
     </w:p>
     <w:p>
       <w:r>
-        <w:t>Repository link: https://github.com/dparsail/heart-disease-mlops (to be made public on submission).</w:t>
+        <w:t>Repository link: https://github.com/dharmendra-2025cs05041/heart-disease-mlops.</w:t>
       </w:r>
     </w:p>
     <w:p>

</xml_diff>